<commit_message>
feat: add wedding deposit checkout receipts
</commit_message>
<xml_diff>
--- a/artifacts/ROS-Counterpoint-Discrepancies-July-24-28-2026.docx
+++ b/artifacts/ROS-Counterpoint-Discrepancies-July-24-28-2026.docx
@@ -90,7 +90,6 @@
         <w:rPr>
           <w:rFonts w:ascii="Calibri" w:hAnsi="Calibri"/>
           <w:b/>
-          <w:i w:val="0"/>
           <w:color w:val="19222E"/>
           <w:sz w:val="22"/>
         </w:rPr>
@@ -99,12 +98,10 @@
       <w:r>
         <w:rPr>
           <w:rFonts w:ascii="Calibri" w:hAnsi="Calibri"/>
-          <w:b w:val="0"/>
-          <w:i w:val="0"/>
           <w:color w:val="19222E"/>
           <w:sz w:val="22"/>
         </w:rPr>
-        <w:t>July 25, July 26, and July 28 are omitted from the findings below.</w:t>
+        <w:t>July 25, July 26, and July 28 have no detailed findings below.</w:t>
       </w:r>
     </w:p>
     <w:p>
@@ -137,7 +134,7 @@
         <w:pStyle w:val="Heading1"/>
       </w:pPr>
       <w:r>
-        <w:t>Discrepancy Summary</w:t>
+        <w:t>Date-by-Date Reconciliation Status</w:t>
       </w:r>
     </w:p>
     <w:tbl>
@@ -172,11 +169,11 @@
             <w:pPr>
               <w:jc w:val="left"/>
             </w:pPr>
+            <w:r/>
             <w:r>
               <w:rPr>
                 <w:rFonts w:ascii="Calibri" w:hAnsi="Calibri"/>
                 <w:b/>
-                <w:i w:val="0"/>
                 <w:color w:val="19222E"/>
                 <w:sz w:val="20"/>
               </w:rPr>
@@ -200,11 +197,11 @@
             <w:pPr>
               <w:jc w:val="center"/>
             </w:pPr>
+            <w:r/>
             <w:r>
               <w:rPr>
                 <w:rFonts w:ascii="Calibri" w:hAnsi="Calibri"/>
                 <w:b/>
-                <w:i w:val="0"/>
                 <w:color w:val="19222E"/>
                 <w:sz w:val="20"/>
               </w:rPr>
@@ -228,11 +225,11 @@
             <w:pPr>
               <w:jc w:val="center"/>
             </w:pPr>
+            <w:r/>
             <w:r>
               <w:rPr>
                 <w:rFonts w:ascii="Calibri" w:hAnsi="Calibri"/>
                 <w:b/>
-                <w:i w:val="0"/>
                 <w:color w:val="19222E"/>
                 <w:sz w:val="20"/>
               </w:rPr>
@@ -256,11 +253,11 @@
             <w:pPr>
               <w:jc w:val="center"/>
             </w:pPr>
+            <w:r/>
             <w:r>
               <w:rPr>
                 <w:rFonts w:ascii="Calibri" w:hAnsi="Calibri"/>
                 <w:b/>
-                <w:i w:val="0"/>
                 <w:color w:val="19222E"/>
                 <w:sz w:val="20"/>
               </w:rPr>
@@ -285,11 +282,11 @@
             <w:pPr>
               <w:jc w:val="left"/>
             </w:pPr>
+            <w:r/>
             <w:r>
               <w:rPr>
                 <w:rFonts w:ascii="Calibri" w:hAnsi="Calibri"/>
                 <w:b/>
-                <w:i w:val="0"/>
                 <w:color w:val="19222E"/>
                 <w:sz w:val="20"/>
               </w:rPr>
@@ -312,11 +309,11 @@
             <w:pPr>
               <w:jc w:val="center"/>
             </w:pPr>
+            <w:r/>
             <w:r>
               <w:rPr>
                 <w:rFonts w:ascii="Calibri" w:hAnsi="Calibri"/>
                 <w:b w:val="0"/>
-                <w:i w:val="0"/>
                 <w:color w:val="9B1C1C"/>
                 <w:sz w:val="20"/>
               </w:rPr>
@@ -339,11 +336,11 @@
             <w:pPr>
               <w:jc w:val="center"/>
             </w:pPr>
+            <w:r/>
             <w:r>
               <w:rPr>
                 <w:rFonts w:ascii="Calibri" w:hAnsi="Calibri"/>
                 <w:b w:val="0"/>
-                <w:i w:val="0"/>
                 <w:color w:val="9B1C1C"/>
                 <w:sz w:val="20"/>
               </w:rPr>
@@ -366,11 +363,11 @@
             <w:pPr>
               <w:jc w:val="center"/>
             </w:pPr>
+            <w:r/>
             <w:r>
               <w:rPr>
                 <w:rFonts w:ascii="Calibri" w:hAnsi="Calibri"/>
                 <w:b w:val="0"/>
-                <w:i w:val="0"/>
                 <w:color w:val="9B1C1C"/>
                 <w:sz w:val="20"/>
               </w:rPr>
@@ -395,15 +392,15 @@
             <w:pPr>
               <w:jc w:val="left"/>
             </w:pPr>
+            <w:r/>
             <w:r>
               <w:rPr>
                 <w:rFonts w:ascii="Calibri" w:hAnsi="Calibri"/>
                 <w:b/>
-                <w:i w:val="0"/>
-                <w:color w:val="19222E"/>
+                <w:color w:val="1F7A52"/>
                 <w:sz w:val="20"/>
               </w:rPr>
-              <w:t>Jul 27</w:t>
+              <w:t>Jul 25</w:t>
             </w:r>
           </w:p>
         </w:tc>
@@ -422,15 +419,15 @@
             <w:pPr>
               <w:jc w:val="center"/>
             </w:pPr>
+            <w:r/>
             <w:r>
               <w:rPr>
                 <w:rFonts w:ascii="Calibri" w:hAnsi="Calibri"/>
                 <w:b w:val="0"/>
-                <w:i w:val="0"/>
-                <w:color w:val="9B1C1C"/>
+                <w:color w:val="1F7A52"/>
                 <w:sz w:val="20"/>
               </w:rPr>
-              <w:t>CP short $360.00</w:t>
+              <w:t>No discrepancies</w:t>
             </w:r>
           </w:p>
         </w:tc>
@@ -449,15 +446,15 @@
             <w:pPr>
               <w:jc w:val="center"/>
             </w:pPr>
+            <w:r/>
             <w:r>
               <w:rPr>
                 <w:rFonts w:ascii="Calibri" w:hAnsi="Calibri"/>
                 <w:b w:val="0"/>
-                <w:i w:val="0"/>
-                <w:color w:val="9B1C1C"/>
+                <w:color w:val="1F7A52"/>
                 <w:sz w:val="20"/>
               </w:rPr>
-              <w:t>CP short $22.75</w:t>
+              <w:t>Exact</w:t>
             </w:r>
           </w:p>
         </w:tc>
@@ -476,12 +473,12 @@
             <w:pPr>
               <w:jc w:val="center"/>
             </w:pPr>
+            <w:r/>
             <w:r>
               <w:rPr>
                 <w:rFonts w:ascii="Calibri" w:hAnsi="Calibri"/>
                 <w:b w:val="0"/>
-                <w:i w:val="0"/>
-                <w:color w:val="19222E"/>
+                <w:color w:val="1F7A52"/>
                 <w:sz w:val="20"/>
               </w:rPr>
               <w:t>Exact</w:t>
@@ -505,15 +502,15 @@
             <w:pPr>
               <w:jc w:val="left"/>
             </w:pPr>
+            <w:r/>
             <w:r>
               <w:rPr>
                 <w:rFonts w:ascii="Calibri" w:hAnsi="Calibri"/>
                 <w:b/>
-                <w:i w:val="0"/>
-                <w:color w:val="19222E"/>
+                <w:color w:val="5E6773"/>
                 <w:sz w:val="20"/>
               </w:rPr>
-              <w:t>Range total</w:t>
+              <w:t>Jul 26</w:t>
             </w:r>
           </w:p>
         </w:tc>
@@ -532,15 +529,15 @@
             <w:pPr>
               <w:jc w:val="center"/>
             </w:pPr>
+            <w:r/>
             <w:r>
               <w:rPr>
                 <w:rFonts w:ascii="Calibri" w:hAnsi="Calibri"/>
                 <w:b w:val="0"/>
-                <w:i w:val="0"/>
-                <w:color w:val="9B1C1C"/>
+                <w:color w:val="5E6773"/>
                 <w:sz w:val="20"/>
               </w:rPr>
-              <w:t>CP short $620.00</w:t>
+              <w:t>No transactions</w:t>
             </w:r>
           </w:p>
         </w:tc>
@@ -559,15 +556,15 @@
             <w:pPr>
               <w:jc w:val="center"/>
             </w:pPr>
+            <w:r/>
             <w:r>
               <w:rPr>
                 <w:rFonts w:ascii="Calibri" w:hAnsi="Calibri"/>
                 <w:b w:val="0"/>
-                <w:i w:val="0"/>
-                <w:color w:val="9B1C1C"/>
+                <w:color w:val="5E6773"/>
                 <w:sz w:val="20"/>
               </w:rPr>
-              <w:t>CP short $45.50</w:t>
+              <w:t>No transactions</w:t>
             </w:r>
           </w:p>
         </w:tc>
@@ -586,11 +583,269 @@
             <w:pPr>
               <w:jc w:val="center"/>
             </w:pPr>
+            <w:r/>
             <w:r>
               <w:rPr>
                 <w:rFonts w:ascii="Calibri" w:hAnsi="Calibri"/>
                 <w:b w:val="0"/>
-                <w:i w:val="0"/>
+                <w:color w:val="5E6773"/>
+                <w:sz w:val="20"/>
+              </w:rPr>
+              <w:t>No transactions</w:t>
+            </w:r>
+          </w:p>
+        </w:tc>
+      </w:tr>
+      <w:tr>
+        <w:tc>
+          <w:tcPr>
+            <w:tcW w:type="dxa" w:w="1500"/>
+            <w:vAlign w:val="center"/>
+          </w:tcPr>
+          <w:p>
+            <w:pPr>
+              <w:jc w:val="left"/>
+            </w:pPr>
+            <w:r/>
+            <w:r>
+              <w:rPr>
+                <w:rFonts w:ascii="Calibri" w:hAnsi="Calibri"/>
+                <w:b/>
+                <w:color w:val="19222E"/>
+                <w:sz w:val="20"/>
+              </w:rPr>
+              <w:t>Jul 27</w:t>
+            </w:r>
+          </w:p>
+        </w:tc>
+        <w:tc>
+          <w:tcPr>
+            <w:tcW w:type="dxa" w:w="2860"/>
+            <w:vAlign w:val="center"/>
+          </w:tcPr>
+          <w:p>
+            <w:pPr>
+              <w:jc w:val="center"/>
+            </w:pPr>
+            <w:r/>
+            <w:r>
+              <w:rPr>
+                <w:rFonts w:ascii="Calibri" w:hAnsi="Calibri"/>
+                <w:b w:val="0"/>
+                <w:color w:val="9B1C1C"/>
+                <w:sz w:val="20"/>
+              </w:rPr>
+              <w:t>CP short $360.00</w:t>
+            </w:r>
+          </w:p>
+        </w:tc>
+        <w:tc>
+          <w:tcPr>
+            <w:tcW w:type="dxa" w:w="2200"/>
+            <w:vAlign w:val="center"/>
+          </w:tcPr>
+          <w:p>
+            <w:pPr>
+              <w:jc w:val="center"/>
+            </w:pPr>
+            <w:r/>
+            <w:r>
+              <w:rPr>
+                <w:rFonts w:ascii="Calibri" w:hAnsi="Calibri"/>
+                <w:b w:val="0"/>
+                <w:color w:val="9B1C1C"/>
+                <w:sz w:val="20"/>
+              </w:rPr>
+              <w:t>CP short $22.75</w:t>
+            </w:r>
+          </w:p>
+        </w:tc>
+        <w:tc>
+          <w:tcPr>
+            <w:tcW w:type="dxa" w:w="2800"/>
+            <w:vAlign w:val="center"/>
+          </w:tcPr>
+          <w:p>
+            <w:pPr>
+              <w:jc w:val="center"/>
+            </w:pPr>
+            <w:r/>
+            <w:r>
+              <w:rPr>
+                <w:rFonts w:ascii="Calibri" w:hAnsi="Calibri"/>
+                <w:b w:val="0"/>
+                <w:color w:val="19222E"/>
+                <w:sz w:val="20"/>
+              </w:rPr>
+              <w:t>Exact</w:t>
+            </w:r>
+          </w:p>
+        </w:tc>
+      </w:tr>
+      <w:tr>
+        <w:tc>
+          <w:tcPr>
+            <w:tcW w:type="dxa" w:w="1500"/>
+            <w:vAlign w:val="center"/>
+          </w:tcPr>
+          <w:p>
+            <w:pPr>
+              <w:jc w:val="left"/>
+            </w:pPr>
+            <w:r/>
+            <w:r>
+              <w:rPr>
+                <w:rFonts w:ascii="Calibri" w:hAnsi="Calibri"/>
+                <w:b/>
+                <w:color w:val="1F7A52"/>
+                <w:sz w:val="20"/>
+              </w:rPr>
+              <w:t>Jul 28</w:t>
+            </w:r>
+          </w:p>
+        </w:tc>
+        <w:tc>
+          <w:tcPr>
+            <w:tcW w:type="dxa" w:w="2860"/>
+            <w:vAlign w:val="center"/>
+          </w:tcPr>
+          <w:p>
+            <w:pPr>
+              <w:jc w:val="center"/>
+            </w:pPr>
+            <w:r/>
+            <w:r>
+              <w:rPr>
+                <w:rFonts w:ascii="Calibri" w:hAnsi="Calibri"/>
+                <w:b w:val="0"/>
+                <w:color w:val="1F7A52"/>
+                <w:sz w:val="20"/>
+              </w:rPr>
+              <w:t>Exact</w:t>
+            </w:r>
+          </w:p>
+        </w:tc>
+        <w:tc>
+          <w:tcPr>
+            <w:tcW w:type="dxa" w:w="2200"/>
+            <w:vAlign w:val="center"/>
+          </w:tcPr>
+          <w:p>
+            <w:pPr>
+              <w:jc w:val="center"/>
+            </w:pPr>
+            <w:r/>
+            <w:r>
+              <w:rPr>
+                <w:rFonts w:ascii="Calibri" w:hAnsi="Calibri"/>
+                <w:b w:val="0"/>
+                <w:color w:val="1F7A52"/>
+                <w:sz w:val="20"/>
+              </w:rPr>
+              <w:t>Exact</w:t>
+            </w:r>
+          </w:p>
+        </w:tc>
+        <w:tc>
+          <w:tcPr>
+            <w:tcW w:type="dxa" w:w="2800"/>
+            <w:vAlign w:val="center"/>
+          </w:tcPr>
+          <w:p>
+            <w:pPr>
+              <w:jc w:val="center"/>
+            </w:pPr>
+            <w:r/>
+            <w:r>
+              <w:rPr>
+                <w:rFonts w:ascii="Calibri" w:hAnsi="Calibri"/>
+                <w:b w:val="0"/>
+                <w:color w:val="1F7A52"/>
+                <w:sz w:val="20"/>
+              </w:rPr>
+              <w:t>Exact</w:t>
+            </w:r>
+          </w:p>
+        </w:tc>
+      </w:tr>
+      <w:tr>
+        <w:tc>
+          <w:tcPr>
+            <w:tcW w:type="dxa" w:w="1500"/>
+            <w:vAlign w:val="center"/>
+          </w:tcPr>
+          <w:p>
+            <w:pPr>
+              <w:jc w:val="left"/>
+            </w:pPr>
+            <w:r/>
+            <w:r>
+              <w:rPr>
+                <w:rFonts w:ascii="Calibri" w:hAnsi="Calibri"/>
+                <w:b/>
+                <w:color w:val="19222E"/>
+                <w:sz w:val="20"/>
+              </w:rPr>
+              <w:t>Range total</w:t>
+            </w:r>
+          </w:p>
+        </w:tc>
+        <w:tc>
+          <w:tcPr>
+            <w:tcW w:type="dxa" w:w="2860"/>
+            <w:vAlign w:val="center"/>
+          </w:tcPr>
+          <w:p>
+            <w:pPr>
+              <w:jc w:val="center"/>
+            </w:pPr>
+            <w:r/>
+            <w:r>
+              <w:rPr>
+                <w:rFonts w:ascii="Calibri" w:hAnsi="Calibri"/>
+                <w:b w:val="0"/>
+                <w:color w:val="9B1C1C"/>
+                <w:sz w:val="20"/>
+              </w:rPr>
+              <w:t>CP short $620.00</w:t>
+            </w:r>
+          </w:p>
+        </w:tc>
+        <w:tc>
+          <w:tcPr>
+            <w:tcW w:type="dxa" w:w="2200"/>
+            <w:vAlign w:val="center"/>
+          </w:tcPr>
+          <w:p>
+            <w:pPr>
+              <w:jc w:val="center"/>
+            </w:pPr>
+            <w:r/>
+            <w:r>
+              <w:rPr>
+                <w:rFonts w:ascii="Calibri" w:hAnsi="Calibri"/>
+                <w:b w:val="0"/>
+                <w:color w:val="9B1C1C"/>
+                <w:sz w:val="20"/>
+              </w:rPr>
+              <w:t>CP short $45.50</w:t>
+            </w:r>
+          </w:p>
+        </w:tc>
+        <w:tc>
+          <w:tcPr>
+            <w:tcW w:type="dxa" w:w="2800"/>
+            <w:vAlign w:val="center"/>
+          </w:tcPr>
+          <w:p>
+            <w:pPr>
+              <w:jc w:val="center"/>
+            </w:pPr>
+            <w:r/>
+            <w:r>
+              <w:rPr>
+                <w:rFonts w:ascii="Calibri" w:hAnsi="Calibri"/>
+                <w:b w:val="0"/>
                 <w:color w:val="9B1C1C"/>
                 <w:sz w:val="20"/>
               </w:rPr>

</xml_diff>